<commit_message>
[HTML-PROJECT] Added some pages explaining about the HTTML stuff.
</commit_message>
<xml_diff>
--- a/HTML-project/HTMLdocx.docx
+++ b/HTML-project/HTMLdocx.docx
@@ -6724,17 +6724,16 @@
       <w:pPr>
         <w:bidi/>
         <w:rPr>
+          <w:u w:val="single"/>
+          <w:rtl/>
+        </w:rPr>
+      </w:pPr>
+      <w:r>
+        <w:rPr>
           <w:rFonts w:hint="cs"/>
           <w:u w:val="single"/>
           <w:rtl/>
         </w:rPr>
-      </w:pPr>
-      <w:r>
-        <w:rPr>
-          <w:rFonts w:hint="cs"/>
-          <w:u w:val="single"/>
-          <w:rtl/>
-        </w:rPr>
         <w:t>בהתחלה:</w:t>
       </w:r>
     </w:p>
@@ -6747,6 +6746,7 @@
       </w:pPr>
       <w:r>
         <w:rPr>
+          <w:noProof/>
           <w:lang w:val="en-US"/>
         </w:rPr>
         <w:drawing>
@@ -6826,6 +6826,7 @@
       </w:pPr>
       <w:r>
         <w:rPr>
+          <w:noProof/>
           <w:lang w:val="en-US"/>
         </w:rPr>
         <w:drawing>
@@ -6882,66 +6883,2219 @@
       <w:pPr>
         <w:bidi/>
         <w:rPr>
+          <w:rFonts w:ascii="Segoe UI Emoji" w:hAnsi="Segoe UI Emoji" w:cs="Segoe UI Emoji"/>
+          <w:rtl/>
+          <w:lang w:val="en-US"/>
+        </w:rPr>
+      </w:pPr>
+      <w:r>
+        <w:rPr>
           <w:rFonts w:hint="cs"/>
           <w:rtl/>
           <w:lang w:val="en-US"/>
         </w:rPr>
-      </w:pPr>
+        <w:t xml:space="preserve">כמובן שה </w:t>
+      </w:r>
+      <w:r>
+        <w:rPr>
+          <w:rFonts w:ascii="Courier New" w:hAnsi="Courier New" w:cs="Courier New"/>
+          <w:lang w:val="en-US"/>
+        </w:rPr>
+        <w:t>&lt;title&gt;</w:t>
+      </w:r>
+      <w:r>
+        <w:rPr>
+          <w:rFonts w:ascii="Courier New" w:hAnsi="Courier New" w:cs="Courier New"/>
+          <w:rtl/>
+          <w:lang w:val="en-US"/>
+        </w:rPr>
+        <w:t xml:space="preserve"> </w:t>
+      </w:r>
       <w:r>
         <w:rPr>
           <w:rFonts w:hint="cs"/>
           <w:rtl/>
           <w:lang w:val="en-US"/>
         </w:rPr>
-        <w:t xml:space="preserve">כמובן שה </w:t>
+        <w:t>שונה בכל עמוד.</w:t>
+      </w:r>
+      <w:r>
+        <w:rPr>
+          <w:rFonts w:ascii="Segoe UI Emoji" w:hAnsi="Segoe UI Emoji" w:cs="Segoe UI Emoji" w:hint="cs"/>
+          <w:rtl/>
+          <w:lang w:val="en-US"/>
+        </w:rPr>
+        <w:t>😉</w:t>
+      </w:r>
+      <w:bookmarkStart w:id="6" w:name="_Toc194227959"/>
+    </w:p>
+    <w:p>
+      <w:pPr>
+        <w:pStyle w:val="3"/>
+        <w:bidi/>
+        <w:rPr>
+          <w:lang w:val="en-US"/>
+        </w:rPr>
+      </w:pPr>
+      <w:r>
+        <w:rPr>
+          <w:rFonts w:hint="cs"/>
+          <w:rtl/>
+          <w:lang w:val="en-US"/>
+        </w:rPr>
+        <w:lastRenderedPageBreak/>
+        <w:t xml:space="preserve">חלקות </w:t>
+      </w:r>
+      <w:r>
+        <w:rPr>
+          <w:lang w:val="en-US"/>
+        </w:rPr>
+        <w:t>HTML</w:t>
+      </w:r>
+      <w:r>
+        <w:rPr>
+          <w:rFonts w:hint="cs"/>
+          <w:rtl/>
+          <w:lang w:val="en-US"/>
+        </w:rPr>
+        <w:t xml:space="preserve"> </w:t>
+      </w:r>
+      <w:r>
+        <w:rPr>
+          <w:rFonts w:cstheme="minorBidi"/>
+          <w:rtl/>
+          <w:lang w:val="en-US"/>
+        </w:rPr>
+        <w:t>–</w:t>
+      </w:r>
+      <w:r>
+        <w:rPr>
+          <w:rFonts w:hint="cs"/>
+          <w:rtl/>
+          <w:lang w:val="en-US"/>
+        </w:rPr>
+        <w:t xml:space="preserve"> </w:t>
+      </w:r>
+      <w:r>
+        <w:rPr>
+          <w:lang w:val="en-US"/>
+        </w:rPr>
+        <w:t>HTML snippets</w:t>
+      </w:r>
+    </w:p>
+    <w:p>
+      <w:pPr>
+        <w:bidi/>
+        <w:rPr>
+          <w:lang w:val="en-US"/>
+        </w:rPr>
+      </w:pPr>
+      <w:r>
+        <w:rPr>
+          <w:rFonts w:hint="cs"/>
+          <w:rtl/>
+          <w:lang w:val="en-US"/>
+        </w:rPr>
+        <w:t xml:space="preserve">בחרתי ליצור כמה </w:t>
+      </w:r>
+      <w:r>
+        <w:rPr>
+          <w:rFonts w:hint="cs"/>
+          <w:i/>
+          <w:iCs/>
+          <w:rtl/>
+          <w:lang w:val="en-US"/>
+        </w:rPr>
+        <w:t xml:space="preserve">חלקות </w:t>
+      </w:r>
+      <w:r>
+        <w:rPr>
+          <w:i/>
+          <w:iCs/>
+          <w:lang w:val="en-US"/>
+        </w:rPr>
+        <w:t>HTML</w:t>
+      </w:r>
+      <w:r>
+        <w:rPr>
+          <w:rFonts w:hint="cs"/>
+          <w:i/>
+          <w:iCs/>
+          <w:rtl/>
+          <w:lang w:val="en-US"/>
+        </w:rPr>
+        <w:t xml:space="preserve"> </w:t>
+      </w:r>
+      <w:r>
+        <w:rPr>
+          <w:rFonts w:hint="cs"/>
+          <w:rtl/>
+          <w:lang w:val="en-US"/>
+        </w:rPr>
+        <w:t>אותם אני אמחזר בחלקים שונים באתר</w:t>
+      </w:r>
+      <w:r>
+        <w:rPr>
+          <w:rFonts w:hint="cs"/>
+          <w:rtl/>
+          <w:lang w:val="en-US"/>
+        </w:rPr>
+        <w:t xml:space="preserve"> על מנת ליצור אחידות וסדר</w:t>
+      </w:r>
+      <w:r>
+        <w:rPr>
+          <w:lang w:val="en-US"/>
+        </w:rPr>
+        <w:t>.</w:t>
+      </w:r>
+    </w:p>
+    <w:p>
+      <w:pPr>
+        <w:bidi/>
+        <w:rPr>
+          <w:rFonts w:hint="cs"/>
+          <w:u w:val="single"/>
+          <w:rtl/>
+          <w:lang w:val="en-US"/>
+        </w:rPr>
+      </w:pPr>
+      <w:r>
+        <w:rPr>
+          <w:rFonts w:hint="cs"/>
+          <w:u w:val="single"/>
+          <w:rtl/>
+          <w:lang w:val="en-US"/>
+        </w:rPr>
+        <w:t>צור קשר</w:t>
+      </w:r>
+    </w:p>
+    <w:p>
+      <w:pPr>
+        <w:bidi/>
+        <w:rPr>
+          <w:rtl/>
+          <w:lang w:val="en-US"/>
+        </w:rPr>
+      </w:pPr>
+      <w:r>
+        <w:rPr>
+          <w:rFonts w:hint="cs"/>
+          <w:rtl/>
+          <w:lang w:val="en-US"/>
+        </w:rPr>
+        <w:t>חלקת הצור קשר נועדה לשמש בעמודים בהם ניקר שלקוחות ירצו ליצור קשר, הקוד של חלקה זו נראה כך:</w:t>
+      </w:r>
+    </w:p>
+    <w:p>
+      <w:pPr>
+        <w:bidi/>
+        <w:rPr>
+          <w:rtl/>
+          <w:lang w:val="en-US"/>
+        </w:rPr>
+      </w:pPr>
+      <w:r>
+        <w:rPr>
+          <w:rFonts w:cs="Arial"/>
+          <w:rtl/>
+          <w:lang w:val="en-US"/>
+        </w:rPr>
+        <w:drawing>
+          <wp:inline distT="0" distB="0" distL="0" distR="0" wp14:anchorId="77352E19" wp14:editId="3810A06B">
+            <wp:extent cx="5731510" cy="1768475"/>
+            <wp:effectExtent l="0" t="0" r="2540" b="3175"/>
+            <wp:docPr id="1353680747" name="תמונה 1" descr="תמונה שמכילה טקסט, צילום מסך, גופן&#10;&#10;תוכן שנוצר על-ידי בינה מלאכותית עשוי להיות שגוי."/>
+            <wp:cNvGraphicFramePr>
+              <a:graphicFrameLocks xmlns:a="http://schemas.openxmlformats.org/drawingml/2006/main" noChangeAspect="1"/>
+            </wp:cNvGraphicFramePr>
+            <a:graphic xmlns:a="http://schemas.openxmlformats.org/drawingml/2006/main">
+              <a:graphicData uri="http://schemas.openxmlformats.org/drawingml/2006/picture">
+                <pic:pic xmlns:pic="http://schemas.openxmlformats.org/drawingml/2006/picture">
+                  <pic:nvPicPr>
+                    <pic:cNvPr id="1353680747" name="תמונה 1" descr="תמונה שמכילה טקסט, צילום מסך, גופן&#10;&#10;תוכן שנוצר על-ידי בינה מלאכותית עשוי להיות שגוי."/>
+                    <pic:cNvPicPr/>
+                  </pic:nvPicPr>
+                  <pic:blipFill>
+                    <a:blip r:embed="rId15"/>
+                    <a:stretch>
+                      <a:fillRect/>
+                    </a:stretch>
+                  </pic:blipFill>
+                  <pic:spPr>
+                    <a:xfrm>
+                      <a:off x="0" y="0"/>
+                      <a:ext cx="5731510" cy="1768475"/>
+                    </a:xfrm>
+                    <a:prstGeom prst="rect">
+                      <a:avLst/>
+                    </a:prstGeom>
+                  </pic:spPr>
+                </pic:pic>
+              </a:graphicData>
+            </a:graphic>
+          </wp:inline>
+        </w:drawing>
+      </w:r>
+    </w:p>
+    <w:p>
+      <w:pPr>
+        <w:bidi/>
+        <w:rPr>
+          <w:rtl/>
+          <w:lang w:val="en-US"/>
+        </w:rPr>
+      </w:pPr>
+      <w:r>
+        <w:rPr>
+          <w:rFonts w:hint="cs"/>
+          <w:rtl/>
+          <w:lang w:val="en-US"/>
+        </w:rPr>
+        <w:t>ובאתר עצמו היא נראית כך:</w:t>
+      </w:r>
+    </w:p>
+    <w:p>
+      <w:pPr>
+        <w:bidi/>
+        <w:rPr>
+          <w:rtl/>
+          <w:lang w:val="en-US"/>
+        </w:rPr>
+      </w:pPr>
+      <w:r>
+        <w:rPr>
+          <w:rFonts w:cs="Arial"/>
+          <w:rtl/>
+          <w:lang w:val="en-US"/>
+        </w:rPr>
+        <w:drawing>
+          <wp:inline distT="0" distB="0" distL="0" distR="0" wp14:anchorId="55269CFD" wp14:editId="7A2E11BE">
+            <wp:extent cx="5731510" cy="831215"/>
+            <wp:effectExtent l="0" t="0" r="2540" b="6985"/>
+            <wp:docPr id="2070686990" name="תמונה 1" descr="תמונה שמכילה טקסט, צילום מסך, גופן&#10;&#10;תוכן שנוצר על-ידי בינה מלאכותית עשוי להיות שגוי."/>
+            <wp:cNvGraphicFramePr>
+              <a:graphicFrameLocks xmlns:a="http://schemas.openxmlformats.org/drawingml/2006/main" noChangeAspect="1"/>
+            </wp:cNvGraphicFramePr>
+            <a:graphic xmlns:a="http://schemas.openxmlformats.org/drawingml/2006/main">
+              <a:graphicData uri="http://schemas.openxmlformats.org/drawingml/2006/picture">
+                <pic:pic xmlns:pic="http://schemas.openxmlformats.org/drawingml/2006/picture">
+                  <pic:nvPicPr>
+                    <pic:cNvPr id="2070686990" name="תמונה 1" descr="תמונה שמכילה טקסט, צילום מסך, גופן&#10;&#10;תוכן שנוצר על-ידי בינה מלאכותית עשוי להיות שגוי."/>
+                    <pic:cNvPicPr/>
+                  </pic:nvPicPr>
+                  <pic:blipFill>
+                    <a:blip r:embed="rId16"/>
+                    <a:stretch>
+                      <a:fillRect/>
+                    </a:stretch>
+                  </pic:blipFill>
+                  <pic:spPr>
+                    <a:xfrm>
+                      <a:off x="0" y="0"/>
+                      <a:ext cx="5731510" cy="831215"/>
+                    </a:xfrm>
+                    <a:prstGeom prst="rect">
+                      <a:avLst/>
+                    </a:prstGeom>
+                  </pic:spPr>
+                </pic:pic>
+              </a:graphicData>
+            </a:graphic>
+          </wp:inline>
+        </w:drawing>
+      </w:r>
+    </w:p>
+    <w:p>
+      <w:pPr>
+        <w:bidi/>
+        <w:rPr>
+          <w:rtl/>
+          <w:lang w:val="en-US"/>
+        </w:rPr>
+      </w:pPr>
+    </w:p>
+    <w:p>
+      <w:pPr>
+        <w:bidi/>
+        <w:rPr>
+          <w:u w:val="single"/>
+          <w:rtl/>
+          <w:lang w:val="en-US"/>
+        </w:rPr>
+      </w:pPr>
+      <w:r>
+        <w:rPr>
+          <w:rFonts w:hint="cs"/>
+          <w:u w:val="single"/>
+          <w:rtl/>
+          <w:lang w:val="en-US"/>
+        </w:rPr>
+        <w:t>תמונה רגילה</w:t>
+      </w:r>
+      <w:r>
+        <w:rPr>
+          <w:rFonts w:hint="cs"/>
+          <w:u w:val="single"/>
+          <w:rtl/>
+          <w:lang w:val="en-US"/>
+        </w:rPr>
+        <w:t xml:space="preserve"> במרכז</w:t>
+      </w:r>
+    </w:p>
+    <w:p>
+      <w:pPr>
+        <w:bidi/>
+        <w:rPr>
+          <w:rtl/>
+          <w:lang w:val="en-US"/>
+        </w:rPr>
+      </w:pPr>
+      <w:r>
+        <w:rPr>
+          <w:rFonts w:hint="cs"/>
+          <w:rtl/>
+          <w:lang w:val="en-US"/>
+        </w:rPr>
+        <w:t>חלקה זו</w:t>
+      </w:r>
+      <w:r>
+        <w:rPr>
+          <w:rFonts w:hint="cs"/>
+          <w:rtl/>
+          <w:lang w:val="en-US"/>
+        </w:rPr>
+        <w:t xml:space="preserve"> נועדה כדי להוסיף תמונה במרכז עם גבול אדום.</w:t>
+      </w:r>
+    </w:p>
+    <w:p>
+      <w:pPr>
+        <w:bidi/>
+        <w:rPr>
+          <w:rtl/>
+          <w:lang w:val="en-US"/>
+        </w:rPr>
+      </w:pPr>
+      <w:r>
+        <w:rPr>
+          <w:rFonts w:hint="cs"/>
+          <w:rtl/>
+          <w:lang w:val="en-US"/>
+        </w:rPr>
+        <w:t>קוד:</w:t>
+      </w:r>
+      <w:r>
+        <w:rPr>
+          <w:lang w:val="en-US"/>
+        </w:rPr>
+        <w:t xml:space="preserve">                                                        </w:t>
+      </w:r>
+    </w:p>
+    <w:p>
+      <w:pPr>
+        <w:bidi/>
+        <w:jc w:val="center"/>
+        <w:rPr>
+          <w:lang w:val="en-US"/>
+        </w:rPr>
+      </w:pPr>
+      <w:r>
+        <w:rPr>
+          <w:rFonts w:cs="Arial"/>
+          <w:rtl/>
+          <w:lang w:val="en-US"/>
+        </w:rPr>
+        <w:drawing>
+          <wp:inline distT="0" distB="0" distL="0" distR="0" wp14:anchorId="1EA7EE06" wp14:editId="0C63FE6A">
+            <wp:extent cx="3595289" cy="1781710"/>
+            <wp:effectExtent l="0" t="0" r="5715" b="9525"/>
+            <wp:docPr id="1408872014" name="תמונה 1"/>
+            <wp:cNvGraphicFramePr>
+              <a:graphicFrameLocks xmlns:a="http://schemas.openxmlformats.org/drawingml/2006/main" noChangeAspect="1"/>
+            </wp:cNvGraphicFramePr>
+            <a:graphic xmlns:a="http://schemas.openxmlformats.org/drawingml/2006/main">
+              <a:graphicData uri="http://schemas.openxmlformats.org/drawingml/2006/picture">
+                <pic:pic xmlns:pic="http://schemas.openxmlformats.org/drawingml/2006/picture">
+                  <pic:nvPicPr>
+                    <pic:cNvPr id="1408872014" name=""/>
+                    <pic:cNvPicPr/>
+                  </pic:nvPicPr>
+                  <pic:blipFill>
+                    <a:blip r:embed="rId17"/>
+                    <a:stretch>
+                      <a:fillRect/>
+                    </a:stretch>
+                  </pic:blipFill>
+                  <pic:spPr>
+                    <a:xfrm>
+                      <a:off x="0" y="0"/>
+                      <a:ext cx="3620470" cy="1794189"/>
+                    </a:xfrm>
+                    <a:prstGeom prst="rect">
+                      <a:avLst/>
+                    </a:prstGeom>
+                  </pic:spPr>
+                </pic:pic>
+              </a:graphicData>
+            </a:graphic>
+          </wp:inline>
+        </w:drawing>
+      </w:r>
+    </w:p>
+    <w:p>
+      <w:pPr>
+        <w:bidi/>
+        <w:jc w:val="center"/>
+        <w:rPr>
+          <w:lang w:val="en-US"/>
+        </w:rPr>
+      </w:pPr>
+    </w:p>
+    <w:p>
+      <w:pPr>
+        <w:bidi/>
+        <w:rPr>
+          <w:rtl/>
+          <w:lang w:val="en-US"/>
+        </w:rPr>
+      </w:pPr>
+      <w:r>
+        <w:rPr>
+          <w:rFonts w:hint="cs"/>
+          <w:rtl/>
+          <w:lang w:val="en-US"/>
+        </w:rPr>
+        <w:lastRenderedPageBreak/>
+        <w:t>באתר עצמו:</w:t>
+      </w:r>
+    </w:p>
+    <w:p>
+      <w:pPr>
+        <w:bidi/>
+        <w:rPr>
+          <w:rFonts w:hint="cs"/>
+          <w:rtl/>
+          <w:lang w:val="en-US"/>
+        </w:rPr>
+      </w:pPr>
+      <w:r>
+        <w:rPr>
+          <w:rFonts w:cs="Arial"/>
+          <w:rtl/>
+          <w:lang w:val="en-US"/>
+        </w:rPr>
+        <w:drawing>
+          <wp:inline distT="0" distB="0" distL="0" distR="0" wp14:anchorId="573F2E8D" wp14:editId="1462F705">
+            <wp:extent cx="5731510" cy="1449070"/>
+            <wp:effectExtent l="0" t="0" r="2540" b="0"/>
+            <wp:docPr id="893148971" name="תמונה 1"/>
+            <wp:cNvGraphicFramePr>
+              <a:graphicFrameLocks xmlns:a="http://schemas.openxmlformats.org/drawingml/2006/main" noChangeAspect="1"/>
+            </wp:cNvGraphicFramePr>
+            <a:graphic xmlns:a="http://schemas.openxmlformats.org/drawingml/2006/main">
+              <a:graphicData uri="http://schemas.openxmlformats.org/drawingml/2006/picture">
+                <pic:pic xmlns:pic="http://schemas.openxmlformats.org/drawingml/2006/picture">
+                  <pic:nvPicPr>
+                    <pic:cNvPr id="893148971" name=""/>
+                    <pic:cNvPicPr/>
+                  </pic:nvPicPr>
+                  <pic:blipFill>
+                    <a:blip r:embed="rId18"/>
+                    <a:stretch>
+                      <a:fillRect/>
+                    </a:stretch>
+                  </pic:blipFill>
+                  <pic:spPr>
+                    <a:xfrm>
+                      <a:off x="0" y="0"/>
+                      <a:ext cx="5731510" cy="1449070"/>
+                    </a:xfrm>
+                    <a:prstGeom prst="rect">
+                      <a:avLst/>
+                    </a:prstGeom>
+                  </pic:spPr>
+                </pic:pic>
+              </a:graphicData>
+            </a:graphic>
+          </wp:inline>
+        </w:drawing>
+      </w:r>
+    </w:p>
+    <w:p>
+      <w:pPr>
+        <w:bidi/>
+        <w:rPr>
+          <w:u w:val="single"/>
+          <w:rtl/>
+          <w:lang w:val="en-US"/>
+        </w:rPr>
+      </w:pPr>
+    </w:p>
+    <w:p>
+      <w:pPr>
+        <w:bidi/>
+        <w:rPr>
+          <w:u w:val="single"/>
+          <w:lang w:val="en-US"/>
+        </w:rPr>
+      </w:pPr>
+    </w:p>
+    <w:p>
+      <w:pPr>
+        <w:bidi/>
+        <w:rPr>
+          <w:u w:val="single"/>
+          <w:rtl/>
+          <w:lang w:val="en-US"/>
+        </w:rPr>
+      </w:pPr>
+    </w:p>
+    <w:p>
+      <w:pPr>
+        <w:pStyle w:val="2"/>
+        <w:rPr>
+          <w:lang w:val="en-US"/>
+        </w:rPr>
+      </w:pPr>
+      <w:r>
+        <w:rPr>
+          <w:rFonts w:hint="cs"/>
+          <w:rtl/>
+          <w:lang w:val="en-US"/>
+        </w:rPr>
+        <w:t>עליי</w:t>
+      </w:r>
+      <w:r>
+        <w:rPr>
+          <w:rFonts w:hint="cs"/>
+          <w:rtl/>
+          <w:lang w:val="en-US"/>
+        </w:rPr>
+        <w:t xml:space="preserve"> </w:t>
+      </w:r>
+      <w:r>
+        <w:rPr>
+          <w:rtl/>
+          <w:lang w:val="en-US"/>
+        </w:rPr>
+        <w:t>–</w:t>
+      </w:r>
+      <w:r>
+        <w:rPr>
+          <w:rFonts w:hint="cs"/>
+          <w:rtl/>
+          <w:lang w:val="en-US"/>
+        </w:rPr>
+        <w:t xml:space="preserve"> </w:t>
+      </w:r>
+      <w:r>
+        <w:rPr>
+          <w:lang w:val="en-US"/>
+        </w:rPr>
+        <w:t>about-me.html</w:t>
+      </w:r>
+    </w:p>
+    <w:p>
+      <w:pPr>
+        <w:bidi/>
+        <w:rPr>
+          <w:rtl/>
+          <w:lang w:val="en-US"/>
+        </w:rPr>
+      </w:pPr>
+      <w:r>
+        <w:rPr>
+          <w:rFonts w:hint="cs"/>
+          <w:rtl/>
+          <w:lang w:val="en-US"/>
+        </w:rPr>
+        <w:t>בעמוד שמספר עליי בחרתי להוסיף פרטים ליצירת קשר, תמונה שלי והסבר קצר על מה אני עושה כרגע בחיים.</w:t>
+      </w:r>
+    </w:p>
+    <w:p>
+      <w:pPr>
+        <w:bidi/>
+        <w:rPr>
+          <w:b/>
+          <w:bCs/>
+          <w:u w:val="single"/>
+          <w:lang w:val="en-US"/>
+        </w:rPr>
+      </w:pPr>
+      <w:r>
+        <w:rPr>
+          <w:rFonts w:hint="cs"/>
+          <w:b/>
+          <w:bCs/>
+          <w:u w:val="single"/>
+          <w:rtl/>
+          <w:lang w:val="en-US"/>
+        </w:rPr>
+        <w:t>התוכן של העמוד נראה כך:</w:t>
+      </w:r>
+    </w:p>
+    <w:p>
+      <w:pPr>
+        <w:bidi/>
+        <w:rPr>
+          <w:b/>
+          <w:bCs/>
+          <w:u w:val="single"/>
+          <w:rtl/>
+          <w:lang w:val="en-US"/>
+        </w:rPr>
+      </w:pPr>
+      <w:r>
+        <w:rPr>
+          <w:rFonts w:cs="Arial"/>
+          <w:b/>
+          <w:bCs/>
+          <w:rtl/>
+          <w:lang w:val="en-US"/>
+        </w:rPr>
+        <w:drawing>
+          <wp:inline distT="0" distB="0" distL="0" distR="0" wp14:anchorId="650F6402" wp14:editId="64DD7A37">
+            <wp:extent cx="5731510" cy="2809875"/>
+            <wp:effectExtent l="0" t="0" r="2540" b="9525"/>
+            <wp:docPr id="636212114" name="תמונה 1" descr="תמונה שמכילה טקסט, צילום מסך, גופן&#10;&#10;תוכן שנוצר על-ידי בינה מלאכותית עשוי להיות שגוי."/>
+            <wp:cNvGraphicFramePr>
+              <a:graphicFrameLocks xmlns:a="http://schemas.openxmlformats.org/drawingml/2006/main" noChangeAspect="1"/>
+            </wp:cNvGraphicFramePr>
+            <a:graphic xmlns:a="http://schemas.openxmlformats.org/drawingml/2006/main">
+              <a:graphicData uri="http://schemas.openxmlformats.org/drawingml/2006/picture">
+                <pic:pic xmlns:pic="http://schemas.openxmlformats.org/drawingml/2006/picture">
+                  <pic:nvPicPr>
+                    <pic:cNvPr id="636212114" name="תמונה 1" descr="תמונה שמכילה טקסט, צילום מסך, גופן&#10;&#10;תוכן שנוצר על-ידי בינה מלאכותית עשוי להיות שגוי."/>
+                    <pic:cNvPicPr/>
+                  </pic:nvPicPr>
+                  <pic:blipFill>
+                    <a:blip r:embed="rId19"/>
+                    <a:stretch>
+                      <a:fillRect/>
+                    </a:stretch>
+                  </pic:blipFill>
+                  <pic:spPr>
+                    <a:xfrm>
+                      <a:off x="0" y="0"/>
+                      <a:ext cx="5731510" cy="2809875"/>
+                    </a:xfrm>
+                    <a:prstGeom prst="rect">
+                      <a:avLst/>
+                    </a:prstGeom>
+                  </pic:spPr>
+                </pic:pic>
+              </a:graphicData>
+            </a:graphic>
+          </wp:inline>
+        </w:drawing>
+      </w:r>
+    </w:p>
+    <w:p>
+      <w:pPr>
+        <w:bidi/>
+        <w:rPr>
+          <w:rtl/>
+          <w:lang w:val="en-US"/>
+        </w:rPr>
+      </w:pPr>
+      <w:r>
+        <w:rPr>
+          <w:rFonts w:hint="cs"/>
+          <w:rtl/>
+          <w:lang w:val="en-US"/>
+        </w:rPr>
+        <w:t>ובאתר עצמו הוא נראה כך:</w:t>
+      </w:r>
+    </w:p>
+    <w:p>
+      <w:pPr>
+        <w:bidi/>
+        <w:jc w:val="center"/>
+        <w:rPr>
+          <w:lang w:val="en-US"/>
+        </w:rPr>
+      </w:pPr>
+      <w:r>
+        <w:rPr>
+          <w:noProof/>
+          <w:lang w:val="en-US"/>
+        </w:rPr>
+        <w:lastRenderedPageBreak/>
+        <w:drawing>
+          <wp:inline distT="0" distB="0" distL="0" distR="0" wp14:anchorId="319CC4AB" wp14:editId="1628CEB6">
+            <wp:extent cx="4543283" cy="2357893"/>
+            <wp:effectExtent l="0" t="0" r="0" b="4445"/>
+            <wp:docPr id="1207551710" name="תמונה 5"/>
+            <wp:cNvGraphicFramePr>
+              <a:graphicFrameLocks xmlns:a="http://schemas.openxmlformats.org/drawingml/2006/main" noChangeAspect="1"/>
+            </wp:cNvGraphicFramePr>
+            <a:graphic xmlns:a="http://schemas.openxmlformats.org/drawingml/2006/main">
+              <a:graphicData uri="http://schemas.openxmlformats.org/drawingml/2006/picture">
+                <pic:pic xmlns:pic="http://schemas.openxmlformats.org/drawingml/2006/picture">
+                  <pic:nvPicPr>
+                    <pic:cNvPr id="0" name="Picture 2"/>
+                    <pic:cNvPicPr>
+                      <a:picLocks noChangeAspect="1" noChangeArrowheads="1"/>
+                    </pic:cNvPicPr>
+                  </pic:nvPicPr>
+                  <pic:blipFill>
+                    <a:blip r:embed="rId20" cstate="print">
+                      <a:extLst>
+                        <a:ext uri="{28A0092B-C50C-407E-A947-70E740481C1C}">
+                          <a14:useLocalDpi xmlns:a14="http://schemas.microsoft.com/office/drawing/2010/main" val="0"/>
+                        </a:ext>
+                      </a:extLst>
+                    </a:blip>
+                    <a:srcRect/>
+                    <a:stretch>
+                      <a:fillRect/>
+                    </a:stretch>
+                  </pic:blipFill>
+                  <pic:spPr bwMode="auto">
+                    <a:xfrm>
+                      <a:off x="0" y="0"/>
+                      <a:ext cx="4575334" cy="2374527"/>
+                    </a:xfrm>
+                    <a:prstGeom prst="rect">
+                      <a:avLst/>
+                    </a:prstGeom>
+                    <a:noFill/>
+                  </pic:spPr>
+                </pic:pic>
+              </a:graphicData>
+            </a:graphic>
+          </wp:inline>
+        </w:drawing>
+      </w:r>
+    </w:p>
+    <w:p>
+      <w:pPr>
+        <w:bidi/>
+        <w:jc w:val="center"/>
+        <w:rPr>
+          <w:lang w:val="en-US"/>
+        </w:rPr>
+      </w:pPr>
+      <w:r>
+        <w:rPr>
+          <w:lang w:val="en-US"/>
+        </w:rPr>
+        <w:t>-</w:t>
+      </w:r>
+    </w:p>
+    <w:p>
+      <w:pPr>
+        <w:bidi/>
+        <w:jc w:val="center"/>
+        <w:rPr>
+          <w:lang w:val="en-US"/>
+        </w:rPr>
+      </w:pPr>
+      <w:r>
+        <w:rPr>
+          <w:rFonts w:cs="Arial"/>
+          <w:rtl/>
+          <w:lang w:val="en-US"/>
+        </w:rPr>
+        <w:drawing>
+          <wp:inline distT="0" distB="0" distL="0" distR="0" wp14:anchorId="437C2C06" wp14:editId="457640D4">
+            <wp:extent cx="4537881" cy="992944"/>
+            <wp:effectExtent l="0" t="0" r="0" b="0"/>
+            <wp:docPr id="739414728" name="תמונה 1"/>
+            <wp:cNvGraphicFramePr>
+              <a:graphicFrameLocks xmlns:a="http://schemas.openxmlformats.org/drawingml/2006/main" noChangeAspect="1"/>
+            </wp:cNvGraphicFramePr>
+            <a:graphic xmlns:a="http://schemas.openxmlformats.org/drawingml/2006/main">
+              <a:graphicData uri="http://schemas.openxmlformats.org/drawingml/2006/picture">
+                <pic:pic xmlns:pic="http://schemas.openxmlformats.org/drawingml/2006/picture">
+                  <pic:nvPicPr>
+                    <pic:cNvPr id="739414728" name=""/>
+                    <pic:cNvPicPr/>
+                  </pic:nvPicPr>
+                  <pic:blipFill>
+                    <a:blip r:embed="rId21"/>
+                    <a:stretch>
+                      <a:fillRect/>
+                    </a:stretch>
+                  </pic:blipFill>
+                  <pic:spPr>
+                    <a:xfrm>
+                      <a:off x="0" y="0"/>
+                      <a:ext cx="4550107" cy="995619"/>
+                    </a:xfrm>
+                    <a:prstGeom prst="rect">
+                      <a:avLst/>
+                    </a:prstGeom>
+                  </pic:spPr>
+                </pic:pic>
+              </a:graphicData>
+            </a:graphic>
+          </wp:inline>
+        </w:drawing>
+      </w:r>
+    </w:p>
+    <w:p>
+      <w:pPr>
+        <w:pStyle w:val="2"/>
+        <w:rPr>
+          <w:rtl/>
+          <w:lang w:val="en-US"/>
+        </w:rPr>
+      </w:pPr>
+      <w:r>
+        <w:rPr>
+          <w:rFonts w:hint="cs"/>
+          <w:rtl/>
+          <w:lang w:val="en-US"/>
+        </w:rPr>
+        <w:t>עלינו</w:t>
+      </w:r>
+      <w:r>
+        <w:rPr>
+          <w:lang w:val="en-US"/>
+        </w:rPr>
+        <w:t xml:space="preserve"> </w:t>
+      </w:r>
+      <w:r>
+        <w:rPr>
+          <w:rtl/>
+          <w:lang w:val="en-US"/>
+        </w:rPr>
+        <w:t>–</w:t>
+      </w:r>
+      <w:r>
+        <w:rPr>
+          <w:rFonts w:hint="cs"/>
+          <w:rtl/>
+          <w:lang w:val="en-US"/>
+        </w:rPr>
+        <w:t xml:space="preserve"> </w:t>
+      </w:r>
+      <w:r>
+        <w:rPr>
+          <w:lang w:val="en-US"/>
+        </w:rPr>
+        <w:t>about.html</w:t>
+      </w:r>
+    </w:p>
+    <w:p>
+      <w:pPr>
+        <w:bidi/>
+        <w:rPr>
+          <w:color w:val="000000" w:themeColor="text1"/>
+          <w:lang w:val="en-US"/>
+        </w:rPr>
+      </w:pPr>
+      <w:r>
+        <w:rPr>
+          <w:rFonts w:hint="cs"/>
+          <w:rtl/>
+          <w:lang w:val="en-US"/>
+        </w:rPr>
+        <w:t xml:space="preserve">בעמוד זה הסברתי על </w:t>
+      </w:r>
+      <w:r>
+        <w:rPr>
+          <w:b/>
+          <w:bCs/>
+          <w:color w:val="C00000"/>
+          <w:lang w:val="en-US"/>
+        </w:rPr>
+        <w:t>Oracle</w:t>
+      </w:r>
+      <w:r>
+        <w:rPr>
+          <w:rFonts w:hint="cs"/>
+          <w:b/>
+          <w:bCs/>
+          <w:color w:val="C00000"/>
+          <w:rtl/>
+          <w:lang w:val="en-US"/>
+        </w:rPr>
+        <w:t xml:space="preserve"> </w:t>
+      </w:r>
+      <w:r>
+        <w:rPr>
+          <w:rFonts w:hint="cs"/>
+          <w:color w:val="000000" w:themeColor="text1"/>
+          <w:rtl/>
+          <w:lang w:val="en-US"/>
+        </w:rPr>
+        <w:t>כחברה</w:t>
+      </w:r>
+      <w:r>
+        <w:rPr>
+          <w:rFonts w:hint="cs"/>
+          <w:color w:val="000000" w:themeColor="text1"/>
+          <w:rtl/>
+          <w:lang w:val="en-US"/>
+        </w:rPr>
+        <w:t>, הכללתי ציטוטים</w:t>
+      </w:r>
+      <w:r>
+        <w:rPr>
+          <w:rFonts w:hint="cs"/>
+          <w:color w:val="000000" w:themeColor="text1"/>
+          <w:rtl/>
+          <w:lang w:val="en-US"/>
+        </w:rPr>
+        <w:t xml:space="preserve">, מה החזון של החברה, העבר של החברה, מה אנחנו מציעים וכן, חלקה ליצירת קשר (השולחת על עמוד ה </w:t>
+      </w:r>
+      <w:r>
+        <w:rPr>
+          <w:rFonts w:hint="cs"/>
+          <w:i/>
+          <w:iCs/>
+          <w:color w:val="000000" w:themeColor="text1"/>
+          <w:rtl/>
+          <w:lang w:val="en-US"/>
+        </w:rPr>
+        <w:t>צור קשר</w:t>
+      </w:r>
+      <w:r>
+        <w:rPr>
+          <w:rFonts w:hint="cs"/>
+          <w:color w:val="000000" w:themeColor="text1"/>
+          <w:rtl/>
+          <w:lang w:val="en-US"/>
+        </w:rPr>
+        <w:t>).</w:t>
+      </w:r>
+    </w:p>
+    <w:p>
+      <w:pPr>
+        <w:bidi/>
+        <w:rPr>
+          <w:b/>
+          <w:bCs/>
+          <w:u w:val="single"/>
+          <w:rtl/>
+          <w:lang w:val="en-US"/>
+        </w:rPr>
+      </w:pPr>
+      <w:r>
+        <w:rPr>
+          <w:rFonts w:hint="cs"/>
+          <w:b/>
+          <w:bCs/>
+          <w:u w:val="single"/>
+          <w:rtl/>
+          <w:lang w:val="en-US"/>
+        </w:rPr>
+        <w:t>התוכן של העמוד נראה כך:</w:t>
+      </w:r>
+    </w:p>
+    <w:p>
+      <w:pPr>
+        <w:bidi/>
+        <w:rPr>
+          <w:rtl/>
+          <w:lang w:val="en-US"/>
+        </w:rPr>
+      </w:pPr>
+      <w:r>
+        <w:rPr>
+          <w:rFonts w:hint="cs"/>
+          <w:rtl/>
+          <w:lang w:val="en-US"/>
+        </w:rPr>
+        <w:t>פתיח</w:t>
+      </w:r>
+      <w:r>
+        <w:rPr>
+          <w:rFonts w:hint="cs"/>
+          <w:rtl/>
+          <w:lang w:val="en-US"/>
+        </w:rPr>
+        <w:t>:</w:t>
+      </w:r>
+    </w:p>
+    <w:p>
+      <w:pPr>
+        <w:bidi/>
+        <w:jc w:val="center"/>
+        <w:rPr>
+          <w:lang w:val="en-US"/>
+        </w:rPr>
+      </w:pPr>
+      <w:r>
+        <w:rPr>
+          <w:rFonts w:cs="Arial"/>
+          <w:rtl/>
+          <w:lang w:val="en-US"/>
+        </w:rPr>
+        <w:lastRenderedPageBreak/>
+        <w:drawing>
+          <wp:inline distT="0" distB="0" distL="0" distR="0" wp14:anchorId="02E00D12" wp14:editId="1C3440EC">
+            <wp:extent cx="4530507" cy="3375544"/>
+            <wp:effectExtent l="0" t="0" r="3810" b="0"/>
+            <wp:docPr id="264332195" name="תמונה 1"/>
+            <wp:cNvGraphicFramePr>
+              <a:graphicFrameLocks xmlns:a="http://schemas.openxmlformats.org/drawingml/2006/main" noChangeAspect="1"/>
+            </wp:cNvGraphicFramePr>
+            <a:graphic xmlns:a="http://schemas.openxmlformats.org/drawingml/2006/main">
+              <a:graphicData uri="http://schemas.openxmlformats.org/drawingml/2006/picture">
+                <pic:pic xmlns:pic="http://schemas.openxmlformats.org/drawingml/2006/picture">
+                  <pic:nvPicPr>
+                    <pic:cNvPr id="264332195" name=""/>
+                    <pic:cNvPicPr/>
+                  </pic:nvPicPr>
+                  <pic:blipFill>
+                    <a:blip r:embed="rId22"/>
+                    <a:stretch>
+                      <a:fillRect/>
+                    </a:stretch>
+                  </pic:blipFill>
+                  <pic:spPr>
+                    <a:xfrm>
+                      <a:off x="0" y="0"/>
+                      <a:ext cx="4537133" cy="3380481"/>
+                    </a:xfrm>
+                    <a:prstGeom prst="rect">
+                      <a:avLst/>
+                    </a:prstGeom>
+                  </pic:spPr>
+                </pic:pic>
+              </a:graphicData>
+            </a:graphic>
+          </wp:inline>
+        </w:drawing>
+      </w:r>
+    </w:p>
+    <w:p>
+      <w:pPr>
+        <w:bidi/>
+        <w:jc w:val="center"/>
+        <w:rPr>
+          <w:rtl/>
+          <w:lang w:val="en-US"/>
+        </w:rPr>
+      </w:pPr>
+      <w:r>
+        <w:rPr>
+          <w:lang w:val="en-US"/>
+        </w:rPr>
+        <w:t>-</w:t>
+      </w:r>
+    </w:p>
+    <w:p>
+      <w:pPr>
+        <w:bidi/>
+        <w:jc w:val="center"/>
+        <w:rPr>
+          <w:lang w:val="en-US"/>
+        </w:rPr>
+      </w:pPr>
+      <w:r>
+        <w:rPr>
+          <w:rFonts w:cs="Arial"/>
+          <w:rtl/>
+          <w:lang w:val="en-US"/>
+        </w:rPr>
+        <w:drawing>
+          <wp:inline distT="0" distB="0" distL="0" distR="0" wp14:anchorId="4D0A81CA" wp14:editId="78956707">
+            <wp:extent cx="4284427" cy="2248066"/>
+            <wp:effectExtent l="0" t="0" r="1905" b="0"/>
+            <wp:docPr id="1193083112" name="תמונה 1"/>
+            <wp:cNvGraphicFramePr>
+              <a:graphicFrameLocks xmlns:a="http://schemas.openxmlformats.org/drawingml/2006/main" noChangeAspect="1"/>
+            </wp:cNvGraphicFramePr>
+            <a:graphic xmlns:a="http://schemas.openxmlformats.org/drawingml/2006/main">
+              <a:graphicData uri="http://schemas.openxmlformats.org/drawingml/2006/picture">
+                <pic:pic xmlns:pic="http://schemas.openxmlformats.org/drawingml/2006/picture">
+                  <pic:nvPicPr>
+                    <pic:cNvPr id="1193083112" name=""/>
+                    <pic:cNvPicPr/>
+                  </pic:nvPicPr>
+                  <pic:blipFill>
+                    <a:blip r:embed="rId23"/>
+                    <a:stretch>
+                      <a:fillRect/>
+                    </a:stretch>
+                  </pic:blipFill>
+                  <pic:spPr>
+                    <a:xfrm>
+                      <a:off x="0" y="0"/>
+                      <a:ext cx="4299276" cy="2255858"/>
+                    </a:xfrm>
+                    <a:prstGeom prst="rect">
+                      <a:avLst/>
+                    </a:prstGeom>
+                  </pic:spPr>
+                </pic:pic>
+              </a:graphicData>
+            </a:graphic>
+          </wp:inline>
+        </w:drawing>
+      </w:r>
+    </w:p>
+    <w:p>
+      <w:pPr>
+        <w:bidi/>
+        <w:rPr>
+          <w:rtl/>
+          <w:lang w:val="en-US"/>
+        </w:rPr>
+      </w:pPr>
+    </w:p>
+    <w:p>
+      <w:pPr>
+        <w:bidi/>
+        <w:rPr>
+          <w:rtl/>
+          <w:lang w:val="en-US"/>
+        </w:rPr>
+      </w:pPr>
+      <w:r>
+        <w:rPr>
+          <w:rFonts w:hint="cs"/>
+          <w:rtl/>
+          <w:lang w:val="en-US"/>
+        </w:rPr>
+        <w:t>היסטוריה וצוות:</w:t>
+      </w:r>
+    </w:p>
+    <w:p>
+      <w:pPr>
+        <w:bidi/>
+        <w:jc w:val="center"/>
+        <w:rPr>
+          <w:rFonts w:hint="cs"/>
+          <w:rtl/>
+          <w:lang w:val="en-US"/>
+        </w:rPr>
+      </w:pPr>
+      <w:r>
+        <w:rPr>
+          <w:rFonts w:cs="Arial"/>
+          <w:rtl/>
+          <w:lang w:val="en-US"/>
+        </w:rPr>
+        <w:lastRenderedPageBreak/>
+        <w:drawing>
+          <wp:inline distT="0" distB="0" distL="0" distR="0" wp14:anchorId="3ABA9352" wp14:editId="74861ACA">
+            <wp:extent cx="5084582" cy="4156221"/>
+            <wp:effectExtent l="0" t="0" r="1905" b="0"/>
+            <wp:docPr id="1599510556" name="תמונה 1" descr="תמונה שמכילה טקסט, צילום מסך, תצוגה&#10;&#10;תוכן שנוצר על-ידי בינה מלאכותית עשוי להיות שגוי."/>
+            <wp:cNvGraphicFramePr>
+              <a:graphicFrameLocks xmlns:a="http://schemas.openxmlformats.org/drawingml/2006/main" noChangeAspect="1"/>
+            </wp:cNvGraphicFramePr>
+            <a:graphic xmlns:a="http://schemas.openxmlformats.org/drawingml/2006/main">
+              <a:graphicData uri="http://schemas.openxmlformats.org/drawingml/2006/picture">
+                <pic:pic xmlns:pic="http://schemas.openxmlformats.org/drawingml/2006/picture">
+                  <pic:nvPicPr>
+                    <pic:cNvPr id="1599510556" name="תמונה 1" descr="תמונה שמכילה טקסט, צילום מסך, תצוגה&#10;&#10;תוכן שנוצר על-ידי בינה מלאכותית עשוי להיות שגוי."/>
+                    <pic:cNvPicPr/>
+                  </pic:nvPicPr>
+                  <pic:blipFill>
+                    <a:blip r:embed="rId24"/>
+                    <a:stretch>
+                      <a:fillRect/>
+                    </a:stretch>
+                  </pic:blipFill>
+                  <pic:spPr>
+                    <a:xfrm>
+                      <a:off x="0" y="0"/>
+                      <a:ext cx="5098706" cy="4167766"/>
+                    </a:xfrm>
+                    <a:prstGeom prst="rect">
+                      <a:avLst/>
+                    </a:prstGeom>
+                  </pic:spPr>
+                </pic:pic>
+              </a:graphicData>
+            </a:graphic>
+          </wp:inline>
+        </w:drawing>
+      </w:r>
+    </w:p>
+    <w:p>
+      <w:pPr>
+        <w:bidi/>
+        <w:rPr>
+          <w:rtl/>
+          <w:lang w:val="en-US"/>
+        </w:rPr>
+      </w:pPr>
+    </w:p>
+    <w:p>
+      <w:pPr>
+        <w:bidi/>
+        <w:rPr>
+          <w:rtl/>
+          <w:lang w:val="en-US"/>
+        </w:rPr>
+      </w:pPr>
+    </w:p>
+    <w:p>
+      <w:pPr>
+        <w:bidi/>
+        <w:rPr>
+          <w:rtl/>
+          <w:lang w:val="en-US"/>
+        </w:rPr>
+      </w:pPr>
+    </w:p>
+    <w:p>
+      <w:pPr>
+        <w:bidi/>
+        <w:jc w:val="center"/>
+        <w:rPr>
+          <w:rtl/>
+          <w:lang w:val="en-US"/>
+        </w:rPr>
+      </w:pPr>
+      <w:r>
+        <w:rPr>
+          <w:rFonts w:cs="Arial"/>
+          <w:rtl/>
+          <w:lang w:val="en-US"/>
+        </w:rPr>
+        <w:drawing>
+          <wp:inline distT="0" distB="0" distL="0" distR="0" wp14:anchorId="5D18DFB1" wp14:editId="0F3AC8C6">
+            <wp:extent cx="6052232" cy="1596539"/>
+            <wp:effectExtent l="0" t="0" r="5715" b="3810"/>
+            <wp:docPr id="893096646" name="תמונה 1"/>
+            <wp:cNvGraphicFramePr>
+              <a:graphicFrameLocks xmlns:a="http://schemas.openxmlformats.org/drawingml/2006/main" noChangeAspect="1"/>
+            </wp:cNvGraphicFramePr>
+            <a:graphic xmlns:a="http://schemas.openxmlformats.org/drawingml/2006/main">
+              <a:graphicData uri="http://schemas.openxmlformats.org/drawingml/2006/picture">
+                <pic:pic xmlns:pic="http://schemas.openxmlformats.org/drawingml/2006/picture">
+                  <pic:nvPicPr>
+                    <pic:cNvPr id="893096646" name=""/>
+                    <pic:cNvPicPr/>
+                  </pic:nvPicPr>
+                  <pic:blipFill>
+                    <a:blip r:embed="rId25"/>
+                    <a:stretch>
+                      <a:fillRect/>
+                    </a:stretch>
+                  </pic:blipFill>
+                  <pic:spPr>
+                    <a:xfrm>
+                      <a:off x="0" y="0"/>
+                      <a:ext cx="6100467" cy="1609263"/>
+                    </a:xfrm>
+                    <a:prstGeom prst="rect">
+                      <a:avLst/>
+                    </a:prstGeom>
+                  </pic:spPr>
+                </pic:pic>
+              </a:graphicData>
+            </a:graphic>
+          </wp:inline>
+        </w:drawing>
+      </w:r>
+    </w:p>
+    <w:p>
+      <w:pPr>
+        <w:bidi/>
+        <w:rPr>
+          <w:rtl/>
+          <w:lang w:val="en-US"/>
+        </w:rPr>
+      </w:pPr>
+    </w:p>
+    <w:p>
+      <w:pPr>
+        <w:bidi/>
+        <w:rPr>
+          <w:rtl/>
+          <w:lang w:val="en-US"/>
+        </w:rPr>
+      </w:pPr>
+    </w:p>
+    <w:p>
+      <w:pPr>
+        <w:bidi/>
+        <w:rPr>
+          <w:rtl/>
+          <w:lang w:val="en-US"/>
+        </w:rPr>
+      </w:pPr>
+    </w:p>
+    <w:p>
+      <w:pPr>
+        <w:bidi/>
+        <w:rPr>
+          <w:rtl/>
+          <w:lang w:val="en-US"/>
+        </w:rPr>
+      </w:pPr>
+      <w:r>
+        <w:rPr>
+          <w:rFonts w:hint="cs"/>
+          <w:rtl/>
+          <w:lang w:val="en-US"/>
+        </w:rPr>
+        <w:t>מה אנו מציעים:</w:t>
+      </w:r>
+    </w:p>
+    <w:p>
+      <w:pPr>
+        <w:bidi/>
+        <w:jc w:val="center"/>
+        <w:rPr>
+          <w:rtl/>
+          <w:lang w:val="en-US"/>
+        </w:rPr>
+      </w:pPr>
+      <w:r>
+        <w:rPr>
+          <w:rFonts w:cs="Arial"/>
+          <w:rtl/>
+          <w:lang w:val="en-US"/>
+        </w:rPr>
+        <w:lastRenderedPageBreak/>
+        <w:drawing>
+          <wp:inline distT="0" distB="0" distL="0" distR="0" wp14:anchorId="3A001768" wp14:editId="54CE5783">
+            <wp:extent cx="4597802" cy="2756848"/>
+            <wp:effectExtent l="0" t="0" r="0" b="5715"/>
+            <wp:docPr id="1350677064" name="תמונה 1" descr="תמונה שמכילה טקסט, צילום מסך, גופן&#10;&#10;תוכן שנוצר על-ידי בינה מלאכותית עשוי להיות שגוי."/>
+            <wp:cNvGraphicFramePr>
+              <a:graphicFrameLocks xmlns:a="http://schemas.openxmlformats.org/drawingml/2006/main" noChangeAspect="1"/>
+            </wp:cNvGraphicFramePr>
+            <a:graphic xmlns:a="http://schemas.openxmlformats.org/drawingml/2006/main">
+              <a:graphicData uri="http://schemas.openxmlformats.org/drawingml/2006/picture">
+                <pic:pic xmlns:pic="http://schemas.openxmlformats.org/drawingml/2006/picture">
+                  <pic:nvPicPr>
+                    <pic:cNvPr id="1350677064" name="תמונה 1" descr="תמונה שמכילה טקסט, צילום מסך, גופן&#10;&#10;תוכן שנוצר על-ידי בינה מלאכותית עשוי להיות שגוי."/>
+                    <pic:cNvPicPr/>
+                  </pic:nvPicPr>
+                  <pic:blipFill>
+                    <a:blip r:embed="rId26"/>
+                    <a:stretch>
+                      <a:fillRect/>
+                    </a:stretch>
+                  </pic:blipFill>
+                  <pic:spPr>
+                    <a:xfrm>
+                      <a:off x="0" y="0"/>
+                      <a:ext cx="4636360" cy="2779968"/>
+                    </a:xfrm>
+                    <a:prstGeom prst="rect">
+                      <a:avLst/>
+                    </a:prstGeom>
+                  </pic:spPr>
+                </pic:pic>
+              </a:graphicData>
+            </a:graphic>
+          </wp:inline>
+        </w:drawing>
+      </w:r>
+    </w:p>
+    <w:p>
+      <w:pPr>
+        <w:bidi/>
+        <w:rPr>
+          <w:lang w:val="en-US"/>
+        </w:rPr>
+      </w:pPr>
+      <w:r>
+        <w:rPr>
+          <w:rFonts w:hint="cs"/>
+          <w:rtl/>
+          <w:lang w:val="en-US"/>
+        </w:rPr>
+        <w:t xml:space="preserve">ניתן לראות שהשתמשתי באלמנטים כמו </w:t>
       </w:r>
       <w:r>
         <w:rPr>
           <w:rFonts w:ascii="Courier New" w:hAnsi="Courier New" w:cs="Courier New"/>
           <w:lang w:val="en-US"/>
         </w:rPr>
-        <w:t>&lt;title&gt;</w:t>
-      </w:r>
+        <w:t>blockquote</w:t>
+      </w:r>
+      <w:r>
+        <w:rPr>
+          <w:rFonts w:hint="cs"/>
+          <w:rtl/>
+          <w:lang w:val="en-US"/>
+        </w:rPr>
+        <w:t xml:space="preserve"> כדי לציין את דעת הלקוחות, או </w:t>
+      </w:r>
+      <w:proofErr w:type="spellStart"/>
       <w:r>
         <w:rPr>
           <w:rFonts w:ascii="Courier New" w:hAnsi="Courier New" w:cs="Courier New"/>
-          <w:rtl/>
+          <w:lang w:val="en-US"/>
+        </w:rPr>
+        <w:t>ul</w:t>
+      </w:r>
+      <w:proofErr w:type="spellEnd"/>
+      <w:r>
+        <w:rPr>
+          <w:rFonts w:hint="cs"/>
+          <w:rtl/>
+          <w:lang w:val="en-US"/>
+        </w:rPr>
+        <w:t xml:space="preserve"> ו </w:t>
+      </w:r>
+      <w:r>
+        <w:rPr>
+          <w:rFonts w:ascii="Courier New" w:hAnsi="Courier New" w:cs="Courier New"/>
+          <w:lang w:val="en-US"/>
+        </w:rPr>
+        <w:t>li</w:t>
+      </w:r>
+      <w:r>
+        <w:rPr>
+          <w:rFonts w:hint="cs"/>
+          <w:rtl/>
+          <w:lang w:val="en-US"/>
+        </w:rPr>
+        <w:t xml:space="preserve"> כדי ליצור רשימה של הדברים שאנו מציעים.</w:t>
+      </w:r>
+    </w:p>
+    <w:p>
+      <w:pPr>
+        <w:bidi/>
+        <w:jc w:val="center"/>
+        <w:rPr>
+          <w:rFonts w:hint="cs"/>
+          <w:lang w:val="en-US"/>
+        </w:rPr>
+      </w:pPr>
+      <w:r>
+        <w:rPr>
+          <w:rFonts w:cs="Arial"/>
+          <w:rtl/>
+          <w:lang w:val="en-US"/>
+        </w:rPr>
+        <w:drawing>
+          <wp:inline distT="0" distB="0" distL="0" distR="0" wp14:anchorId="242BD6F8" wp14:editId="484D7ECB">
+            <wp:extent cx="5217711" cy="1256158"/>
+            <wp:effectExtent l="0" t="0" r="2540" b="1270"/>
+            <wp:docPr id="1106968847" name="תמונה 1" descr="תמונה שמכילה טקסט, צילום מסך, גופן, אלגברה&#10;&#10;תוכן שנוצר על-ידי בינה מלאכותית עשוי להיות שגוי."/>
+            <wp:cNvGraphicFramePr>
+              <a:graphicFrameLocks xmlns:a="http://schemas.openxmlformats.org/drawingml/2006/main" noChangeAspect="1"/>
+            </wp:cNvGraphicFramePr>
+            <a:graphic xmlns:a="http://schemas.openxmlformats.org/drawingml/2006/main">
+              <a:graphicData uri="http://schemas.openxmlformats.org/drawingml/2006/picture">
+                <pic:pic xmlns:pic="http://schemas.openxmlformats.org/drawingml/2006/picture">
+                  <pic:nvPicPr>
+                    <pic:cNvPr id="1106968847" name="תמונה 1" descr="תמונה שמכילה טקסט, צילום מסך, גופן, אלגברה&#10;&#10;תוכן שנוצר על-ידי בינה מלאכותית עשוי להיות שגוי."/>
+                    <pic:cNvPicPr/>
+                  </pic:nvPicPr>
+                  <pic:blipFill>
+                    <a:blip r:embed="rId27"/>
+                    <a:stretch>
+                      <a:fillRect/>
+                    </a:stretch>
+                  </pic:blipFill>
+                  <pic:spPr>
+                    <a:xfrm>
+                      <a:off x="0" y="0"/>
+                      <a:ext cx="5252489" cy="1264531"/>
+                    </a:xfrm>
+                    <a:prstGeom prst="rect">
+                      <a:avLst/>
+                    </a:prstGeom>
+                  </pic:spPr>
+                </pic:pic>
+              </a:graphicData>
+            </a:graphic>
+          </wp:inline>
+        </w:drawing>
+      </w:r>
+    </w:p>
+    <w:p>
+      <w:pPr>
+        <w:bidi/>
+        <w:rPr>
+          <w:rtl/>
+        </w:rPr>
+      </w:pPr>
+      <w:r>
+        <w:rPr>
+          <w:rFonts w:hint="cs"/>
+          <w:rtl/>
+        </w:rPr>
+        <w:t>לבסוף גם, הוספתי את החלקה ליצירת קשר:</w:t>
+      </w:r>
+    </w:p>
+    <w:p>
+      <w:pPr>
+        <w:bidi/>
+        <w:jc w:val="center"/>
+        <w:rPr>
+          <w:rtl/>
+        </w:rPr>
+      </w:pPr>
+      <w:r>
+        <w:rPr>
+          <w:rFonts w:cs="Arial"/>
+          <w:rtl/>
+        </w:rPr>
+        <w:drawing>
+          <wp:inline distT="0" distB="0" distL="0" distR="0" wp14:anchorId="05B03595" wp14:editId="57CC8789">
+            <wp:extent cx="5661623" cy="1746913"/>
+            <wp:effectExtent l="0" t="0" r="0" b="5715"/>
+            <wp:docPr id="1040523896" name="תמונה 1" descr="תמונה שמכילה טקסט, צילום מסך, גופן&#10;&#10;תוכן שנוצר על-ידי בינה מלאכותית עשוי להיות שגוי."/>
+            <wp:cNvGraphicFramePr>
+              <a:graphicFrameLocks xmlns:a="http://schemas.openxmlformats.org/drawingml/2006/main" noChangeAspect="1"/>
+            </wp:cNvGraphicFramePr>
+            <a:graphic xmlns:a="http://schemas.openxmlformats.org/drawingml/2006/main">
+              <a:graphicData uri="http://schemas.openxmlformats.org/drawingml/2006/picture">
+                <pic:pic xmlns:pic="http://schemas.openxmlformats.org/drawingml/2006/picture">
+                  <pic:nvPicPr>
+                    <pic:cNvPr id="1040523896" name="תמונה 1" descr="תמונה שמכילה טקסט, צילום מסך, גופן&#10;&#10;תוכן שנוצר על-ידי בינה מלאכותית עשוי להיות שגוי."/>
+                    <pic:cNvPicPr/>
+                  </pic:nvPicPr>
+                  <pic:blipFill>
+                    <a:blip r:embed="rId15"/>
+                    <a:stretch>
+                      <a:fillRect/>
+                    </a:stretch>
+                  </pic:blipFill>
+                  <pic:spPr>
+                    <a:xfrm>
+                      <a:off x="0" y="0"/>
+                      <a:ext cx="5735536" cy="1769719"/>
+                    </a:xfrm>
+                    <a:prstGeom prst="rect">
+                      <a:avLst/>
+                    </a:prstGeom>
+                  </pic:spPr>
+                </pic:pic>
+              </a:graphicData>
+            </a:graphic>
+          </wp:inline>
+        </w:drawing>
+      </w:r>
+    </w:p>
+    <w:p>
+      <w:pPr>
+        <w:bidi/>
+        <w:rPr>
+          <w:rtl/>
+        </w:rPr>
+      </w:pPr>
+      <w:r>
+        <w:rPr>
+          <w:rFonts w:cs="Arial"/>
+          <w:rtl/>
+        </w:rPr>
+        <w:drawing>
+          <wp:inline distT="0" distB="0" distL="0" distR="0" wp14:anchorId="3CD7377C" wp14:editId="130E2B0B">
+            <wp:extent cx="5731510" cy="860425"/>
+            <wp:effectExtent l="0" t="0" r="2540" b="0"/>
+            <wp:docPr id="1398327874" name="תמונה 1" descr="תמונה שמכילה טקסט, צילום מסך, גופן&#10;&#10;תוכן שנוצר על-ידי בינה מלאכותית עשוי להיות שגוי."/>
+            <wp:cNvGraphicFramePr>
+              <a:graphicFrameLocks xmlns:a="http://schemas.openxmlformats.org/drawingml/2006/main" noChangeAspect="1"/>
+            </wp:cNvGraphicFramePr>
+            <a:graphic xmlns:a="http://schemas.openxmlformats.org/drawingml/2006/main">
+              <a:graphicData uri="http://schemas.openxmlformats.org/drawingml/2006/picture">
+                <pic:pic xmlns:pic="http://schemas.openxmlformats.org/drawingml/2006/picture">
+                  <pic:nvPicPr>
+                    <pic:cNvPr id="1398327874" name="תמונה 1" descr="תמונה שמכילה טקסט, צילום מסך, גופן&#10;&#10;תוכן שנוצר על-ידי בינה מלאכותית עשוי להיות שגוי."/>
+                    <pic:cNvPicPr/>
+                  </pic:nvPicPr>
+                  <pic:blipFill>
+                    <a:blip r:embed="rId28"/>
+                    <a:stretch>
+                      <a:fillRect/>
+                    </a:stretch>
+                  </pic:blipFill>
+                  <pic:spPr>
+                    <a:xfrm>
+                      <a:off x="0" y="0"/>
+                      <a:ext cx="5731510" cy="860425"/>
+                    </a:xfrm>
+                    <a:prstGeom prst="rect">
+                      <a:avLst/>
+                    </a:prstGeom>
+                  </pic:spPr>
+                </pic:pic>
+              </a:graphicData>
+            </a:graphic>
+          </wp:inline>
+        </w:drawing>
+      </w:r>
+    </w:p>
+    <w:p>
+      <w:pPr>
+        <w:pStyle w:val="2"/>
+        <w:rPr>
+          <w:rtl/>
+          <w:lang w:val="en-US"/>
+        </w:rPr>
+      </w:pPr>
+      <w:r>
+        <w:rPr>
+          <w:rFonts w:hint="cs"/>
+          <w:rtl/>
+          <w:lang w:val="en-US"/>
+        </w:rPr>
+        <w:lastRenderedPageBreak/>
+        <w:t>מפתחים</w:t>
+      </w:r>
+      <w:r>
+        <w:rPr>
           <w:lang w:val="en-US"/>
         </w:rPr>
         <w:t xml:space="preserve"> </w:t>
       </w:r>
       <w:r>
         <w:rPr>
+          <w:rtl/>
+          <w:lang w:val="en-US"/>
+        </w:rPr>
+        <w:t>–</w:t>
+      </w:r>
+      <w:r>
+        <w:rPr>
           <w:rFonts w:hint="cs"/>
           <w:rtl/>
           <w:lang w:val="en-US"/>
         </w:rPr>
-        <w:t>שונה בכל עמוד.</w:t>
-      </w:r>
-      <w:r>
-        <w:rPr>
-          <w:rFonts w:ascii="Segoe UI Emoji" w:hAnsi="Segoe UI Emoji" w:cs="Segoe UI Emoji" w:hint="cs"/>
-          <w:rtl/>
-          <w:lang w:val="en-US"/>
-        </w:rPr>
-        <w:t>😉</w:t>
-      </w:r>
-    </w:p>
-    <w:p>
-      <w:pPr>
-        <w:bidi/>
-        <w:rPr>
-          <w:rtl/>
-        </w:rPr>
-      </w:pPr>
+        <w:t xml:space="preserve"> </w:t>
+      </w:r>
+      <w:r>
+        <w:rPr>
+          <w:lang w:val="en-US"/>
+        </w:rPr>
+        <w:t>developers</w:t>
+      </w:r>
+      <w:r>
+        <w:rPr>
+          <w:lang w:val="en-US"/>
+        </w:rPr>
+        <w:t>.html</w:t>
+      </w:r>
+    </w:p>
+    <w:p>
+      <w:pPr>
+        <w:bidi/>
+        <w:rPr>
+          <w:rtl/>
+        </w:rPr>
+      </w:pPr>
+      <w:r>
+        <w:rPr>
+          <w:rFonts w:hint="cs"/>
+          <w:rtl/>
+        </w:rPr>
+        <w:t>בעמוד זה הסברתי על הפתרונות והאירועים שאנו מציעים.</w:t>
+      </w:r>
+    </w:p>
+    <w:p>
+      <w:pPr>
+        <w:bidi/>
+        <w:rPr>
+          <w:rtl/>
+        </w:rPr>
+      </w:pPr>
+    </w:p>
+    <w:p>
+      <w:pPr>
+        <w:bidi/>
+        <w:rPr>
+          <w:b/>
+          <w:bCs/>
+          <w:u w:val="single"/>
+          <w:rtl/>
+          <w:lang w:val="en-US"/>
+        </w:rPr>
+      </w:pPr>
+      <w:r>
+        <w:rPr>
+          <w:rFonts w:hint="cs"/>
+          <w:b/>
+          <w:bCs/>
+          <w:u w:val="single"/>
+          <w:rtl/>
+          <w:lang w:val="en-US"/>
+        </w:rPr>
+        <w:t>התוכן של העמוד נראה כך:</w:t>
+      </w:r>
+    </w:p>
+    <w:p>
+      <w:pPr>
+        <w:bidi/>
+        <w:rPr>
+          <w:b/>
+          <w:bCs/>
+          <w:u w:val="single"/>
+          <w:rtl/>
+          <w:lang w:val="en-US"/>
+        </w:rPr>
+      </w:pPr>
+    </w:p>
+    <w:p>
+      <w:pPr>
+        <w:bidi/>
+        <w:rPr>
+          <w:rFonts w:hint="cs"/>
+          <w:rtl/>
+          <w:lang w:val="en-US"/>
+        </w:rPr>
+      </w:pPr>
+      <w:r>
+        <w:rPr>
+          <w:rFonts w:hint="cs"/>
+          <w:rtl/>
+          <w:lang w:val="en-US"/>
+        </w:rPr>
+        <w:t>א</w:t>
+      </w:r>
+      <w:r>
+        <w:rPr>
+          <w:rFonts w:hint="cs"/>
+          <w:rtl/>
+          <w:lang w:val="en-US"/>
+        </w:rPr>
+        <w:t>ינטרו:</w:t>
+      </w:r>
+    </w:p>
+    <w:p>
+      <w:pPr>
+        <w:rPr>
+          <w:rtl/>
+        </w:rPr>
+      </w:pPr>
+      <w:r>
+        <w:drawing>
+          <wp:inline distT="0" distB="0" distL="0" distR="0" wp14:anchorId="377AF945" wp14:editId="1148F193">
+            <wp:extent cx="5731510" cy="2893060"/>
+            <wp:effectExtent l="0" t="0" r="2540" b="2540"/>
+            <wp:docPr id="23324331" name="תמונה 1" descr="תמונה שמכילה טקסט, צילום מסך, גופן&#10;&#10;תוכן שנוצר על-ידי בינה מלאכותית עשוי להיות שגוי."/>
+            <wp:cNvGraphicFramePr>
+              <a:graphicFrameLocks xmlns:a="http://schemas.openxmlformats.org/drawingml/2006/main" noChangeAspect="1"/>
+            </wp:cNvGraphicFramePr>
+            <a:graphic xmlns:a="http://schemas.openxmlformats.org/drawingml/2006/main">
+              <a:graphicData uri="http://schemas.openxmlformats.org/drawingml/2006/picture">
+                <pic:pic xmlns:pic="http://schemas.openxmlformats.org/drawingml/2006/picture">
+                  <pic:nvPicPr>
+                    <pic:cNvPr id="23324331" name="תמונה 1" descr="תמונה שמכילה טקסט, צילום מסך, גופן&#10;&#10;תוכן שנוצר על-ידי בינה מלאכותית עשוי להיות שגוי."/>
+                    <pic:cNvPicPr/>
+                  </pic:nvPicPr>
+                  <pic:blipFill>
+                    <a:blip r:embed="rId29"/>
+                    <a:stretch>
+                      <a:fillRect/>
+                    </a:stretch>
+                  </pic:blipFill>
+                  <pic:spPr>
+                    <a:xfrm>
+                      <a:off x="0" y="0"/>
+                      <a:ext cx="5731510" cy="2893060"/>
+                    </a:xfrm>
+                    <a:prstGeom prst="rect">
+                      <a:avLst/>
+                    </a:prstGeom>
+                  </pic:spPr>
+                </pic:pic>
+              </a:graphicData>
+            </a:graphic>
+          </wp:inline>
+        </w:drawing>
+      </w:r>
+    </w:p>
+    <w:p>
+      <w:pPr>
+        <w:rPr>
+          <w:rtl/>
+        </w:rPr>
+      </w:pPr>
+    </w:p>
+    <w:p>
+      <w:pPr>
+        <w:rPr>
+          <w:rtl/>
+        </w:rPr>
+      </w:pPr>
+      <w:r>
+        <w:drawing>
+          <wp:inline distT="0" distB="0" distL="0" distR="0" wp14:anchorId="4BF4676E" wp14:editId="66D8C33B">
+            <wp:extent cx="5731510" cy="2659380"/>
+            <wp:effectExtent l="0" t="0" r="2540" b="7620"/>
+            <wp:docPr id="2143316843" name="תמונה 1" descr="תמונה שמכילה טקסט, צילום מסך, תוכנה, מולטימדיה&#10;&#10;תוכן שנוצר על-ידי בינה מלאכותית עשוי להיות שגוי."/>
+            <wp:cNvGraphicFramePr>
+              <a:graphicFrameLocks xmlns:a="http://schemas.openxmlformats.org/drawingml/2006/main" noChangeAspect="1"/>
+            </wp:cNvGraphicFramePr>
+            <a:graphic xmlns:a="http://schemas.openxmlformats.org/drawingml/2006/main">
+              <a:graphicData uri="http://schemas.openxmlformats.org/drawingml/2006/picture">
+                <pic:pic xmlns:pic="http://schemas.openxmlformats.org/drawingml/2006/picture">
+                  <pic:nvPicPr>
+                    <pic:cNvPr id="2143316843" name="תמונה 1" descr="תמונה שמכילה טקסט, צילום מסך, תוכנה, מולטימדיה&#10;&#10;תוכן שנוצר על-ידי בינה מלאכותית עשוי להיות שגוי."/>
+                    <pic:cNvPicPr/>
+                  </pic:nvPicPr>
+                  <pic:blipFill>
+                    <a:blip r:embed="rId30"/>
+                    <a:stretch>
+                      <a:fillRect/>
+                    </a:stretch>
+                  </pic:blipFill>
+                  <pic:spPr>
+                    <a:xfrm>
+                      <a:off x="0" y="0"/>
+                      <a:ext cx="5731510" cy="2659380"/>
+                    </a:xfrm>
+                    <a:prstGeom prst="rect">
+                      <a:avLst/>
+                    </a:prstGeom>
+                  </pic:spPr>
+                </pic:pic>
+              </a:graphicData>
+            </a:graphic>
+          </wp:inline>
+        </w:drawing>
+      </w:r>
+    </w:p>
+    <w:p>
+      <w:pPr>
+        <w:rPr>
+          <w:rtl/>
+        </w:rPr>
+      </w:pPr>
+    </w:p>
+    <w:p>
+      <w:pPr>
+        <w:bidi/>
+        <w:rPr>
+          <w:rtl/>
+        </w:rPr>
+      </w:pPr>
+      <w:r>
+        <w:rPr>
+          <w:rFonts w:hint="cs"/>
+          <w:rtl/>
+        </w:rPr>
+        <w:lastRenderedPageBreak/>
+        <w:t>פתרונות שאנו מציעים:</w:t>
+      </w:r>
+    </w:p>
+    <w:p>
+      <w:pPr>
+        <w:bidi/>
+        <w:rPr>
+          <w:rtl/>
+        </w:rPr>
+      </w:pPr>
+      <w:r>
+        <w:rPr>
+          <w:rFonts w:cs="Arial"/>
+          <w:rtl/>
+        </w:rPr>
+        <w:drawing>
+          <wp:inline distT="0" distB="0" distL="0" distR="0" wp14:anchorId="7646E61C" wp14:editId="00CC39E3">
+            <wp:extent cx="5731510" cy="2496185"/>
+            <wp:effectExtent l="0" t="0" r="2540" b="0"/>
+            <wp:docPr id="2066961092" name="תמונה 1" descr="תמונה שמכילה טקסט, צילום מסך, גופן&#10;&#10;תוכן שנוצר על-ידי בינה מלאכותית עשוי להיות שגוי."/>
+            <wp:cNvGraphicFramePr>
+              <a:graphicFrameLocks xmlns:a="http://schemas.openxmlformats.org/drawingml/2006/main" noChangeAspect="1"/>
+            </wp:cNvGraphicFramePr>
+            <a:graphic xmlns:a="http://schemas.openxmlformats.org/drawingml/2006/main">
+              <a:graphicData uri="http://schemas.openxmlformats.org/drawingml/2006/picture">
+                <pic:pic xmlns:pic="http://schemas.openxmlformats.org/drawingml/2006/picture">
+                  <pic:nvPicPr>
+                    <pic:cNvPr id="2066961092" name="תמונה 1" descr="תמונה שמכילה טקסט, צילום מסך, גופן&#10;&#10;תוכן שנוצר על-ידי בינה מלאכותית עשוי להיות שגוי."/>
+                    <pic:cNvPicPr/>
+                  </pic:nvPicPr>
+                  <pic:blipFill>
+                    <a:blip r:embed="rId31"/>
+                    <a:stretch>
+                      <a:fillRect/>
+                    </a:stretch>
+                  </pic:blipFill>
+                  <pic:spPr>
+                    <a:xfrm>
+                      <a:off x="0" y="0"/>
+                      <a:ext cx="5731510" cy="2496185"/>
+                    </a:xfrm>
+                    <a:prstGeom prst="rect">
+                      <a:avLst/>
+                    </a:prstGeom>
+                  </pic:spPr>
+                </pic:pic>
+              </a:graphicData>
+            </a:graphic>
+          </wp:inline>
+        </w:drawing>
+      </w:r>
+    </w:p>
+    <w:p>
+      <w:pPr>
+        <w:bidi/>
+        <w:rPr>
+          <w:rtl/>
+        </w:rPr>
+      </w:pPr>
+    </w:p>
+    <w:p>
+      <w:pPr>
+        <w:bidi/>
+        <w:rPr>
+          <w:rtl/>
+          <w:lang w:val="en-US"/>
+        </w:rPr>
+      </w:pPr>
+      <w:r>
+        <w:rPr>
+          <w:rFonts w:hint="cs"/>
+          <w:rtl/>
+        </w:rPr>
+        <w:t xml:space="preserve">כאן השתמשתי ב </w:t>
+      </w:r>
+      <w:r>
+        <w:rPr>
+          <w:lang w:val="en-US"/>
+        </w:rPr>
+        <w:t>class</w:t>
+      </w:r>
+      <w:r>
+        <w:rPr>
+          <w:rFonts w:hint="cs"/>
+          <w:rtl/>
+          <w:lang w:val="en-US"/>
+        </w:rPr>
+        <w:t xml:space="preserve">-ים חדשים של </w:t>
+      </w:r>
+      <w:r>
+        <w:rPr>
+          <w:lang w:val="en-US"/>
+        </w:rPr>
+        <w:t>CSS</w:t>
+      </w:r>
+      <w:r>
+        <w:rPr>
+          <w:rFonts w:hint="cs"/>
+          <w:rtl/>
+          <w:lang w:val="en-US"/>
+        </w:rPr>
+        <w:t>, כדי לגרום לרקע להיות כחול בהיר, ולגבול של התמונה כחול יותר כהה.</w:t>
+      </w:r>
+    </w:p>
+    <w:p>
+      <w:pPr>
+        <w:bidi/>
+        <w:rPr>
+          <w:rtl/>
+          <w:lang w:val="en-US"/>
+        </w:rPr>
+      </w:pPr>
+    </w:p>
+    <w:p>
+      <w:pPr>
+        <w:bidi/>
+        <w:rPr>
+          <w:rtl/>
+        </w:rPr>
+      </w:pPr>
+      <w:r>
+        <w:rPr>
+          <w:noProof/>
+        </w:rPr>
+        <w:drawing>
+          <wp:inline distT="0" distB="0" distL="0" distR="0" wp14:anchorId="091FB4C2" wp14:editId="49AB1791">
+            <wp:extent cx="5663821" cy="2936339"/>
+            <wp:effectExtent l="0" t="0" r="0" b="0"/>
+            <wp:docPr id="2116953843" name="תמונה 6"/>
+            <wp:cNvGraphicFramePr>
+              <a:graphicFrameLocks xmlns:a="http://schemas.openxmlformats.org/drawingml/2006/main" noChangeAspect="1"/>
+            </wp:cNvGraphicFramePr>
+            <a:graphic xmlns:a="http://schemas.openxmlformats.org/drawingml/2006/main">
+              <a:graphicData uri="http://schemas.openxmlformats.org/drawingml/2006/picture">
+                <pic:pic xmlns:pic="http://schemas.openxmlformats.org/drawingml/2006/picture">
+                  <pic:nvPicPr>
+                    <pic:cNvPr id="0" name="Picture 3"/>
+                    <pic:cNvPicPr>
+                      <a:picLocks noChangeAspect="1" noChangeArrowheads="1"/>
+                    </pic:cNvPicPr>
+                  </pic:nvPicPr>
+                  <pic:blipFill>
+                    <a:blip r:embed="rId32" cstate="print">
+                      <a:extLst>
+                        <a:ext uri="{28A0092B-C50C-407E-A947-70E740481C1C}">
+                          <a14:useLocalDpi xmlns:a14="http://schemas.microsoft.com/office/drawing/2010/main" val="0"/>
+                        </a:ext>
+                      </a:extLst>
+                    </a:blip>
+                    <a:srcRect/>
+                    <a:stretch>
+                      <a:fillRect/>
+                    </a:stretch>
+                  </pic:blipFill>
+                  <pic:spPr bwMode="auto">
+                    <a:xfrm>
+                      <a:off x="0" y="0"/>
+                      <a:ext cx="5679260" cy="2944343"/>
+                    </a:xfrm>
+                    <a:prstGeom prst="rect">
+                      <a:avLst/>
+                    </a:prstGeom>
+                    <a:noFill/>
+                  </pic:spPr>
+                </pic:pic>
+              </a:graphicData>
+            </a:graphic>
+          </wp:inline>
+        </w:drawing>
+      </w:r>
+    </w:p>
+    <w:p>
+      <w:pPr>
+        <w:bidi/>
+        <w:rPr>
+          <w:rtl/>
+        </w:rPr>
+      </w:pPr>
+    </w:p>
+    <w:p>
+      <w:pPr>
+        <w:bidi/>
+        <w:rPr>
+          <w:rtl/>
+        </w:rPr>
+      </w:pPr>
+    </w:p>
+    <w:p>
+      <w:pPr>
+        <w:bidi/>
+        <w:rPr>
+          <w:rtl/>
+        </w:rPr>
+      </w:pPr>
+    </w:p>
+    <w:p>
+      <w:pPr>
+        <w:bidi/>
+        <w:rPr>
+          <w:rtl/>
+        </w:rPr>
+      </w:pPr>
+    </w:p>
+    <w:p>
+      <w:pPr>
+        <w:bidi/>
+        <w:rPr>
+          <w:rtl/>
+        </w:rPr>
+      </w:pPr>
+      <w:r>
+        <w:rPr>
+          <w:rFonts w:hint="cs"/>
+          <w:rtl/>
+        </w:rPr>
+        <w:lastRenderedPageBreak/>
+        <w:t>קהילה ואירועים:</w:t>
+      </w:r>
+    </w:p>
+    <w:p>
+      <w:pPr>
+        <w:bidi/>
+        <w:rPr>
+          <w:rtl/>
+        </w:rPr>
+      </w:pPr>
+      <w:r>
+        <w:rPr>
+          <w:rFonts w:cs="Arial"/>
+          <w:rtl/>
+        </w:rPr>
+        <w:drawing>
+          <wp:inline distT="0" distB="0" distL="0" distR="0" wp14:anchorId="53FA9947" wp14:editId="330026AD">
+            <wp:extent cx="5731510" cy="3330575"/>
+            <wp:effectExtent l="0" t="0" r="2540" b="3175"/>
+            <wp:docPr id="1187666033" name="תמונה 1"/>
+            <wp:cNvGraphicFramePr>
+              <a:graphicFrameLocks xmlns:a="http://schemas.openxmlformats.org/drawingml/2006/main" noChangeAspect="1"/>
+            </wp:cNvGraphicFramePr>
+            <a:graphic xmlns:a="http://schemas.openxmlformats.org/drawingml/2006/main">
+              <a:graphicData uri="http://schemas.openxmlformats.org/drawingml/2006/picture">
+                <pic:pic xmlns:pic="http://schemas.openxmlformats.org/drawingml/2006/picture">
+                  <pic:nvPicPr>
+                    <pic:cNvPr id="1187666033" name="תמונה 1"/>
+                    <pic:cNvPicPr/>
+                  </pic:nvPicPr>
+                  <pic:blipFill>
+                    <a:blip r:embed="rId33"/>
+                    <a:stretch>
+                      <a:fillRect/>
+                    </a:stretch>
+                  </pic:blipFill>
+                  <pic:spPr>
+                    <a:xfrm>
+                      <a:off x="0" y="0"/>
+                      <a:ext cx="5731510" cy="3330575"/>
+                    </a:xfrm>
+                    <a:prstGeom prst="rect">
+                      <a:avLst/>
+                    </a:prstGeom>
+                  </pic:spPr>
+                </pic:pic>
+              </a:graphicData>
+            </a:graphic>
+          </wp:inline>
+        </w:drawing>
+      </w:r>
+    </w:p>
+    <w:p>
+      <w:pPr>
+        <w:bidi/>
+        <w:rPr>
+          <w:rtl/>
+        </w:rPr>
+      </w:pPr>
+    </w:p>
+    <w:p>
+      <w:pPr>
+        <w:bidi/>
+        <w:rPr>
+          <w:rtl/>
+        </w:rPr>
+      </w:pPr>
+      <w:r>
+        <w:rPr>
+          <w:rFonts w:cs="Arial"/>
+          <w:rtl/>
+        </w:rPr>
+        <w:drawing>
+          <wp:inline distT="0" distB="0" distL="0" distR="0" wp14:anchorId="50A67664" wp14:editId="19B67776">
+            <wp:extent cx="5731510" cy="2969895"/>
+            <wp:effectExtent l="0" t="0" r="2540" b="1905"/>
+            <wp:docPr id="447330393" name="תמונה 1" descr="תמונה שמכילה טקסט, צילום מסך, תוכנה, דף אינטרנט&#10;&#10;תוכן שנוצר על-ידי בינה מלאכותית עשוי להיות שגוי."/>
+            <wp:cNvGraphicFramePr>
+              <a:graphicFrameLocks xmlns:a="http://schemas.openxmlformats.org/drawingml/2006/main" noChangeAspect="1"/>
+            </wp:cNvGraphicFramePr>
+            <a:graphic xmlns:a="http://schemas.openxmlformats.org/drawingml/2006/main">
+              <a:graphicData uri="http://schemas.openxmlformats.org/drawingml/2006/picture">
+                <pic:pic xmlns:pic="http://schemas.openxmlformats.org/drawingml/2006/picture">
+                  <pic:nvPicPr>
+                    <pic:cNvPr id="447330393" name="תמונה 1" descr="תמונה שמכילה טקסט, צילום מסך, תוכנה, דף אינטרנט&#10;&#10;תוכן שנוצר על-ידי בינה מלאכותית עשוי להיות שגוי."/>
+                    <pic:cNvPicPr/>
+                  </pic:nvPicPr>
+                  <pic:blipFill>
+                    <a:blip r:embed="rId34"/>
+                    <a:stretch>
+                      <a:fillRect/>
+                    </a:stretch>
+                  </pic:blipFill>
+                  <pic:spPr>
+                    <a:xfrm>
+                      <a:off x="0" y="0"/>
+                      <a:ext cx="5731510" cy="2969895"/>
+                    </a:xfrm>
+                    <a:prstGeom prst="rect">
+                      <a:avLst/>
+                    </a:prstGeom>
+                  </pic:spPr>
+                </pic:pic>
+              </a:graphicData>
+            </a:graphic>
+          </wp:inline>
+        </w:drawing>
+      </w:r>
     </w:p>
     <w:p>
       <w:pPr>
         <w:pStyle w:val="1"/>
-      </w:pPr>
-      <w:bookmarkStart w:id="6" w:name="_Toc194227959"/>
-    </w:p>
-    <w:p/>
+        <w:rPr>
+          <w:rtl/>
+        </w:rPr>
+      </w:pPr>
+    </w:p>
     <w:p>
       <w:pPr>
         <w:pStyle w:val="1"/>
@@ -7019,13 +9173,13 @@
         <w:lastRenderedPageBreak/>
         <w:t xml:space="preserve">דפי </w:t>
       </w:r>
-      <w:r>
-        <w:rPr>
-          <w:lang w:val="en-US"/>
-        </w:rPr>
-        <w:t>ASP</w:t>
-      </w:r>
       <w:bookmarkEnd w:id="7"/>
+      <w:r>
+        <w:rPr>
+          <w:lang w:val="en-US"/>
+        </w:rPr>
+        <w:t>PHP</w:t>
+      </w:r>
     </w:p>
     <w:p>
       <w:pPr>
@@ -7230,8 +9384,8 @@
       </w:pPr>
     </w:p>
     <w:sectPr>
-      <w:headerReference w:type="default" r:id="rId15"/>
-      <w:footerReference w:type="default" r:id="rId16"/>
+      <w:headerReference w:type="default" r:id="rId35"/>
+      <w:footerReference w:type="default" r:id="rId36"/>
       <w:pgSz w:w="11906" w:h="16838"/>
       <w:pgMar w:top="1440" w:right="1440" w:bottom="1440" w:left="1440" w:header="708" w:footer="708" w:gutter="0"/>
       <w:cols w:space="708"/>
@@ -8832,6 +10986,7 @@
   <w:style w:type="character" w:default="1" w:styleId="a0">
     <w:name w:val="Default Paragraph Font"/>
     <w:uiPriority w:val="1"/>
+    <w:semiHidden/>
     <w:unhideWhenUsed/>
   </w:style>
   <w:style w:type="table" w:default="1" w:styleId="a1">

</xml_diff>